<commit_message>
chore: snapshot current project state with mongo and qdrant data
</commit_message>
<xml_diff>
--- a/Backend/data/Data Raw/Khác/CTDT_Fit.docx
+++ b/Backend/data/Data Raw/Khác/CTDT_Fit.docx
@@ -842,6 +842,28 @@
     <w:p>
       <w:pPr>
         <w:spacing w:before="120" w:after="0" w:line="288" w:lineRule="auto"/>
+        <w:rPr>
+          <w:lang w:val="vi-VN"/>
+        </w:rPr>
+      </w:pPr>
+      <w:r>
+        <w:rPr>
+          <w:b/>
+          <w:bCs/>
+          <w:lang w:val="vi-VN"/>
+        </w:rPr>
+        <w:t xml:space="preserve">Tham khảo chương trình đào tạo chi tiết tại đây: </w:t>
+      </w:r>
+      <w:r>
+        <w:rPr>
+          <w:lang w:val="vi-VN"/>
+        </w:rPr>
+        <w:t>https://fit.agu.edu.vn/bai-viet/gioi-thieu/dai-hoc-cong-nghe-thong-tin-10.html</w:t>
+      </w:r>
+    </w:p>
+    <w:p>
+      <w:pPr>
+        <w:spacing w:before="120" w:after="0" w:line="288" w:lineRule="auto"/>
         <w:jc w:val="center"/>
         <w:rPr>
           <w:b/>
@@ -912,25 +934,13 @@
         <w:rPr>
           <w:b/>
           <w:bCs/>
-          <w:lang w:val="vi-VN"/>
-        </w:rPr>
-      </w:pPr>
-    </w:p>
-    <w:p>
-      <w:pPr>
-        <w:spacing w:before="120" w:after="0" w:line="288" w:lineRule="auto"/>
-        <w:jc w:val="center"/>
-        <w:rPr>
-          <w:b/>
-          <w:bCs/>
-        </w:rPr>
-      </w:pPr>
-      <w:r>
-        <w:rPr>
-          <w:b/>
-          <w:bCs/>
-        </w:rPr>
-        <w:lastRenderedPageBreak/>
+        </w:rPr>
+      </w:pPr>
+      <w:r>
+        <w:rPr>
+          <w:b/>
+          <w:bCs/>
+        </w:rPr>
         <w:t>CHƯƠNG</w:t>
       </w:r>
       <w:r>
@@ -1291,6 +1301,7 @@
                 <w:b/>
                 <w:bCs/>
               </w:rPr>
+              <w:lastRenderedPageBreak/>
               <w:t>ELO 3</w:t>
             </w:r>
           </w:p>
@@ -1341,7 +1352,6 @@
                 <w:b/>
                 <w:bCs/>
               </w:rPr>
-              <w:lastRenderedPageBreak/>
               <w:t>ELO 4</w:t>
             </w:r>
           </w:p>
@@ -1799,6 +1809,28 @@
           <w:lang w:val="vi-VN"/>
         </w:rPr>
       </w:pPr>
+      <w:r>
+        <w:rPr>
+          <w:b/>
+          <w:bCs/>
+          <w:lang w:val="vi-VN"/>
+        </w:rPr>
+        <w:t>Tham khảo chương trình đào tạo chi tiết tại đây:</w:t>
+      </w:r>
+      <w:r>
+        <w:rPr>
+          <w:b/>
+          <w:bCs/>
+          <w:lang w:val="vi-VN"/>
+        </w:rPr>
+        <w:t xml:space="preserve"> </w:t>
+      </w:r>
+      <w:r>
+        <w:rPr>
+          <w:lang w:val="vi-VN"/>
+        </w:rPr>
+        <w:t>https://fit.agu.edu.vn/bai-viet/gioi-thieu/dai-hoc-ky-thuat-phan-mem-11.html</w:t>
+      </w:r>
     </w:p>
     <w:sectPr>
       <w:pgSz w:w="12240" w:h="15840"/>
@@ -3031,6 +3063,7 @@
   <w:style w:type="character" w:default="1" w:styleId="DefaultParagraphFont">
     <w:name w:val="Default Paragraph Font"/>
     <w:uiPriority w:val="1"/>
+    <w:semiHidden/>
     <w:unhideWhenUsed/>
   </w:style>
   <w:style w:type="table" w:default="1" w:styleId="TableNormal">

</xml_diff>